<commit_message>
Update installation guide and its build script
Replit-Commit-Author: Agent
</commit_message>
<xml_diff>
--- a/docs/manual/Orivellum_Installation_Guide.docx
+++ b/docs/manual/Orivellum_Installation_Guide.docx
@@ -1152,7 +1152,7 @@
         <w:spacing w:after="120"/>
       </w:pPr>
       <w:r>
-        <w:t>Lemonade is a local LLM inference server compatible with the OpenAI API. It runs AI models on your own GPU (AMD ROCm or NVIDIA CUDA) or CPU, keeping every conversation and document 100% private and offline.</w:t>
+        <w:t>Lemonade Server is AMD's official local LLM inference tool for Ryzen AI hardware. Unlike generic inference tools, Lemonade automatically schedules workloads across the NPU (XDNA2), iGPU (RDNA 3.5), and CPU — no manual GPU flags needed. Every conversation and document stays 100% private and offline.</w:t>
       </w:r>
     </w:p>
     <w:p>
@@ -1205,7 +1205,7 @@
           <w:color w:val="808080"/>
           <w:sz w:val="18"/>
         </w:rPr>
-        <w:t>Lemonade loads GGUF model files and serves them via OpenAI-compatible API</w:t>
+        <w:t>Lemonade auto-schedules across NPU, iGPU, and CPU — no manual GPU config required</w:t>
       </w:r>
     </w:p>
     <w:p>
@@ -1221,7 +1221,7 @@
         <w:spacing w:after="120"/>
       </w:pPr>
       <w:r>
-        <w:t>Download and install from the official releases:</w:t>
+        <w:t>Download the Windows installer from the official site:</w:t>
       </w:r>
     </w:p>
     <w:p>
@@ -1236,27 +1236,48 @@
           <w:color w:val="1A1A2E"/>
           <w:sz w:val="18"/>
         </w:rPr>
-        <w:t># AMD GPU (ROCm) or CPU</w:t>
+        <w:t># 1. Visit https://lemonade-server.ai and download the Windows installer</w:t>
         <w:br/>
-        <w:t>pip install lemonade-server</w:t>
+        <w:t># 2. Run the installer</w:t>
+        <w:br/>
+        <w:t># 3. Lemonade registers itself to START AUTOMATICALLY AT LOGIN — no manual launch needed</w:t>
         <w:br/>
         <w:br/>
-        <w:t># NVIDIA GPU (CUDA)</w:t>
+        <w:t># Verify it is running:</w:t>
         <w:br/>
-        <w:t>pip install lemonade-server[cuda]</w:t>
+        <w:t>Invoke-WebRequest http://127.0.0.1:8000/api/v0/health -UseBasicParsing</w:t>
         <w:br/>
-        <w:br/>
-        <w:t># Windows installer available at:</w:t>
-        <w:br/>
-        <w:t># https://github.com/lemonade-llm/lemonade/releases</w:t>
+        <w:t># Expected: {"status":"ok"}</w:t>
       </w:r>
     </w:p>
     <w:p>
       <w:pPr>
+        <w:spacing w:before="80" w:after="160"/>
+        <w:ind w:left="288" w:right="288"/>
+        <w:shd w:val="clear" w:color="auto" w:fill="E8F5E9"/>
+      </w:pPr>
+      <w:r>
+        <w:rPr>
+          <w:color w:val="1A5C2E"/>
+          <w:sz w:val="20"/>
+        </w:rPr>
+        <w:t>✅  Lemonade installs as a background service. After the first install it starts automatically — you will never need to launch it manually again.</w:t>
+      </w:r>
+    </w:p>
+    <w:p>
+      <w:pPr>
         <w:pStyle w:val="Heading2"/>
       </w:pPr>
       <w:r>
-        <w:t>Start the Lemonade server</w:t>
+        <w:t>Pull your models</w:t>
+      </w:r>
+    </w:p>
+    <w:p>
+      <w:pPr>
+        <w:spacing w:after="120"/>
+      </w:pPr>
+      <w:r>
+        <w:t>Use lemonade pull to download models. These are the models Orivellum is configured to use:</w:t>
       </w:r>
     </w:p>
     <w:p>
@@ -1271,33 +1292,34 @@
           <w:color w:val="1A1A2E"/>
           <w:sz w:val="18"/>
         </w:rPr>
-        <w:t># Default port 13305</w:t>
+        <w:t># Primary chat model — 70 B on iGPU, 128 K context (~40 GB)</w:t>
         <w:br/>
-        <w:t>lemonade serve</w:t>
+        <w:t>lemonade pull llama3.3-70b</w:t>
         <w:br/>
         <w:br/>
-        <w:t># Load a specific model on start</w:t>
+        <w:t># Reasoner — 120 B (fits entirely in 128 GB unified RAM)</w:t>
         <w:br/>
-        <w:t>lemonade serve --model /path/to/model.gguf</w:t>
+        <w:t>lemonade pull gpt-oss-120b</w:t>
         <w:br/>
         <w:br/>
-        <w:t># Custom port</w:t>
+        <w:t># Fast model — runs on the NPU for sub-second first token</w:t>
         <w:br/>
-        <w:t>lemonade serve --port 13305</w:t>
-      </w:r>
-    </w:p>
-    <w:p>
-      <w:pPr>
-        <w:spacing w:before="80" w:after="160"/>
-        <w:ind w:left="288" w:right="288"/>
-        <w:shd w:val="clear" w:color="auto" w:fill="E8F5E9"/>
-      </w:pPr>
-      <w:r>
-        <w:rPr>
-          <w:color w:val="1A5C2E"/>
-          <w:sz w:val="20"/>
-        </w:rPr>
-        <w:t>✅  Lemonade defaults to port 13305, which matches the Orivellum default setting.</w:t>
+        <w:t>lemonade pull phi4</w:t>
+        <w:br/>
+        <w:br/>
+        <w:t># Coder — 32 B on iGPU, 256 K context</w:t>
+        <w:br/>
+        <w:t>lemonade pull qwen2.5-coder-32b</w:t>
+        <w:br/>
+        <w:br/>
+        <w:t># Embeddings for semantic search</w:t>
+        <w:br/>
+        <w:t>lemonade pull nomic-embed-text</w:t>
+        <w:br/>
+        <w:br/>
+        <w:t># Check what you have:</w:t>
+        <w:br/>
+        <w:t>lemonade list</w:t>
       </w:r>
     </w:p>
     <w:p>
@@ -1332,7 +1354,7 @@
         <w:spacing w:after="60"/>
       </w:pPr>
       <w:r>
-        <w:t>Under "Local AI Model (Lemonade)" set the URL to:</w:t>
+        <w:t>Under "Local AI (Lemonade)" verify the URL is set to:</w:t>
       </w:r>
     </w:p>
     <w:p>
@@ -1347,7 +1369,7 @@
           <w:color w:val="1A1A2E"/>
           <w:sz w:val="18"/>
         </w:rPr>
-        <w:t>http://127.0.0.1:13305/api/v1</w:t>
+        <w:t>http://127.0.0.1:8000/v1</w:t>
       </w:r>
     </w:p>
     <w:p>
@@ -1356,7 +1378,7 @@
         <w:spacing w:after="60"/>
       </w:pPr>
       <w:r>
-        <w:t>Optionally enter a Model ID from the table in Section 6</w:t>
+        <w:t>The model slots are already configured in config.yaml — no manual model ID entry needed</w:t>
       </w:r>
     </w:p>
     <w:p>
@@ -1373,7 +1395,7 @@
         <w:pStyle w:val="Heading2"/>
       </w:pPr>
       <w:r>
-        <w:t>GPU vs CPU mode</w:t>
+        <w:t>Hardware scheduling (automatic)</w:t>
       </w:r>
     </w:p>
     <w:p>
@@ -1381,7 +1403,7 @@
         <w:spacing w:after="120"/>
       </w:pPr>
       <w:r>
-        <w:t>Lemonade automatically detects available hardware:</w:t>
+        <w:t>Lemonade picks the best hardware for each model size automatically:</w:t>
       </w:r>
     </w:p>
     <w:p>
@@ -1390,7 +1412,7 @@
         <w:spacing w:after="60"/>
       </w:pPr>
       <w:r>
-        <w:t>AMD GPU (ROCm): fastest — requires ROCm 5.7+</w:t>
+        <w:t>NPU (XDNA2, 50 TOPS): 7–14 B models — low power, sub-second first token (phi4)</w:t>
       </w:r>
     </w:p>
     <w:p>
@@ -1399,7 +1421,7 @@
         <w:spacing w:after="60"/>
       </w:pPr>
       <w:r>
-        <w:t>NVIDIA GPU (CUDA): fast — requires CUDA 12+</w:t>
+        <w:t>iGPU (40 RDNA 3.5 CUs, ≈ RTX 4070): 32–120 B models — full GPU offload (llama3.3-70b, gpt-oss-120b)</w:t>
       </w:r>
     </w:p>
     <w:p>
@@ -1408,21 +1430,21 @@
         <w:spacing w:after="60"/>
       </w:pPr>
       <w:r>
-        <w:t>CPU: works on any machine; 5–15x slower than GPU</w:t>
+        <w:t>Unified 128 GB LPDDR5X: no separate VRAM — all models fit entirely on-chip</w:t>
       </w:r>
     </w:p>
     <w:p>
       <w:pPr>
         <w:spacing w:before="80" w:after="160"/>
         <w:ind w:left="288" w:right="288"/>
-        <w:shd w:val="clear" w:color="auto" w:fill="FDE8E8"/>
+        <w:shd w:val="clear" w:color="auto" w:fill="E8F5E9"/>
       </w:pPr>
       <w:r>
         <w:rPr>
-          <w:color w:val="8B1A1A"/>
+          <w:color w:val="1A5C2E"/>
           <w:sz w:val="20"/>
         </w:rPr>
-        <w:t>⚠️  On CPU, use models with 4 billion parameters or fewer (Phi-4 Mini, Gemma 2 2B, Llama 3.2 3B). Larger models will be too slow for interactive use.</w:t>
+        <w:t>✅  The Ryzen AI Max+ 395 has ~112 GB allocatable to models. llama3.3-70b uses ~40 GB, gpt-oss-120b uses ~65 GB — both fit comfortably.</w:t>
       </w:r>
     </w:p>
     <w:p>
@@ -1435,7 +1457,7 @@
         <w:pStyle w:val="Heading1"/>
       </w:pPr>
       <w:r>
-        <w:t>6.  Recommended LLM Models for Lemonade</w:t>
+        <w:t>6.  Orivellum Model Slots &amp; Recommended Models</w:t>
       </w:r>
     </w:p>
     <w:p>
@@ -1443,15 +1465,7 @@
         <w:spacing w:after="120"/>
       </w:pPr>
       <w:r>
-        <w:t>All models below are freely available in GGUF format from Hugging Face. They are OpenAI-API-compatible and work directly with Lemonade. Download them and load via the Lemonade CLI or web interface.</w:t>
-      </w:r>
-    </w:p>
-    <w:p>
-      <w:pPr>
-        <w:spacing w:after="120"/>
-      </w:pPr>
-      <w:r>
-        <w:t>Quantization guide:  Q4_K_M = smaller/faster, some quality loss  •  Q8_0 = larger/slower, near full quality</w:t>
+        <w:t>Orivellum uses six named model slots, each optimised for a specific type of work. All slots are configured in config.yaml in the project root — you do not set them one by one in the UI. The defaults below are tuned for the AMD Ryzen AI Max+ 395.</w:t>
       </w:r>
     </w:p>
     <w:tbl>
@@ -1471,36 +1485,6 @@
       <w:tr>
         <w:tc>
           <w:tcPr>
-            <w:tcW w:type="dxa" w:w="2664"/>
-            <w:shd w:val="clear" w:color="auto" w:fill="1a3a2a"/>
-          </w:tcPr>
-          <w:p>
-            <w:r>
-              <w:rPr>
-                <w:b/>
-                <w:color w:val="FFFFFF"/>
-              </w:rPr>
-              <w:t>Model</w:t>
-            </w:r>
-          </w:p>
-        </w:tc>
-        <w:tc>
-          <w:tcPr>
-            <w:tcW w:type="dxa" w:w="1008"/>
-            <w:shd w:val="clear" w:color="auto" w:fill="1a3a2a"/>
-          </w:tcPr>
-          <w:p>
-            <w:r>
-              <w:rPr>
-                <w:b/>
-                <w:color w:val="FFFFFF"/>
-              </w:rPr>
-              <w:t>Parameters</w:t>
-            </w:r>
-          </w:p>
-        </w:tc>
-        <w:tc>
-          <w:tcPr>
             <w:tcW w:type="dxa" w:w="1080"/>
             <w:shd w:val="clear" w:color="auto" w:fill="1a3a2a"/>
           </w:tcPr>
@@ -1510,7 +1494,37 @@
                 <w:b/>
                 <w:color w:val="FFFFFF"/>
               </w:rPr>
-              <w:t>Quant</w:t>
+              <w:t>Slot</w:t>
+            </w:r>
+          </w:p>
+        </w:tc>
+        <w:tc>
+          <w:tcPr>
+            <w:tcW w:type="dxa" w:w="1512"/>
+            <w:shd w:val="clear" w:color="auto" w:fill="1a3a2a"/>
+          </w:tcPr>
+          <w:p>
+            <w:r>
+              <w:rPr>
+                <w:b/>
+                <w:color w:val="FFFFFF"/>
+              </w:rPr>
+              <w:t>config.yaml key</w:t>
+            </w:r>
+          </w:p>
+        </w:tc>
+        <w:tc>
+          <w:tcPr>
+            <w:tcW w:type="dxa" w:w="2016"/>
+            <w:shd w:val="clear" w:color="auto" w:fill="1a3a2a"/>
+          </w:tcPr>
+          <w:p>
+            <w:r>
+              <w:rPr>
+                <w:b/>
+                <w:color w:val="FFFFFF"/>
+              </w:rPr>
+              <w:t>Purpose</w:t>
             </w:r>
           </w:p>
         </w:tc>
@@ -1525,13 +1539,13 @@
                 <w:b/>
                 <w:color w:val="FFFFFF"/>
               </w:rPr>
-              <w:t>Best For</w:t>
+              <w:t>Recommended model</w:t>
             </w:r>
           </w:p>
         </w:tc>
         <w:tc>
           <w:tcPr>
-            <w:tcW w:type="dxa" w:w="1296"/>
+            <w:tcW w:type="dxa" w:w="1440"/>
             <w:shd w:val="clear" w:color="auto" w:fill="1a3a2a"/>
           </w:tcPr>
           <w:p>
@@ -1540,7 +1554,7 @@
                 <w:b/>
                 <w:color w:val="FFFFFF"/>
               </w:rPr>
-              <w:t>VRAM / RAM</w:t>
+              <w:t>Hardware used</w:t>
             </w:r>
           </w:p>
         </w:tc>
@@ -1548,34 +1562,36 @@
       <w:tr>
         <w:tc>
           <w:tcPr>
-            <w:tcW w:type="dxa" w:w="2664"/>
+            <w:tcW w:type="dxa" w:w="1080"/>
             <w:shd w:val="clear" w:color="auto" w:fill="FFFFFF"/>
           </w:tcPr>
           <w:p>
             <w:r>
-              <w:t>Meta Llama 3.2 3B Instruct</w:t>
+              <w:t>Workhorse</w:t>
             </w:r>
           </w:p>
         </w:tc>
         <w:tc>
           <w:tcPr>
-            <w:tcW w:type="dxa" w:w="1008"/>
+            <w:tcW w:type="dxa" w:w="1512"/>
             <w:shd w:val="clear" w:color="auto" w:fill="FFFFFF"/>
           </w:tcPr>
           <w:p>
             <w:r>
-              <w:t>3B</w:t>
+              <w:t>workhorse_model</w:t>
             </w:r>
           </w:p>
         </w:tc>
         <w:tc>
           <w:tcPr>
-            <w:tcW w:type="dxa" w:w="1080"/>
+            <w:tcW w:type="dxa" w:w="2016"/>
             <w:shd w:val="clear" w:color="auto" w:fill="FFFFFF"/>
           </w:tcPr>
           <w:p>
             <w:r>
-              <w:t>Q8_0</w:t>
+              <w:t>Chat, summarisation, general</w:t>
+              <w:br/>
+              <w:t>reasoning, web research</w:t>
             </w:r>
           </w:p>
         </w:tc>
@@ -1586,18 +1602,22 @@
           </w:tcPr>
           <w:p>
             <w:r>
-              <w:t>Fast chat, summaries, CPU</w:t>
+              <w:t>llama3.3-70b</w:t>
+              <w:br/>
+              <w:t>(alt: Qwen3-30B-A3B, Qwen3-32B)</w:t>
             </w:r>
           </w:p>
         </w:tc>
         <w:tc>
           <w:tcPr>
-            <w:tcW w:type="dxa" w:w="1296"/>
+            <w:tcW w:type="dxa" w:w="1440"/>
             <w:shd w:val="clear" w:color="auto" w:fill="FFFFFF"/>
           </w:tcPr>
           <w:p>
             <w:r>
-              <w:t>3–4 GB</w:t>
+              <w:t>iGPU (RDNA 3.5)</w:t>
+              <w:br/>
+              <w:t>~40 GB of 112 GB</w:t>
             </w:r>
           </w:p>
         </w:tc>
@@ -1605,34 +1625,36 @@
       <w:tr>
         <w:tc>
           <w:tcPr>
-            <w:tcW w:type="dxa" w:w="2664"/>
+            <w:tcW w:type="dxa" w:w="1080"/>
             <w:shd w:val="clear" w:color="auto" w:fill="F4F7F5"/>
           </w:tcPr>
           <w:p>
             <w:r>
-              <w:t>Meta Llama 3.1 8B Instruct</w:t>
+              <w:t>Reasoner</w:t>
             </w:r>
           </w:p>
         </w:tc>
         <w:tc>
           <w:tcPr>
-            <w:tcW w:type="dxa" w:w="1008"/>
+            <w:tcW w:type="dxa" w:w="1512"/>
             <w:shd w:val="clear" w:color="auto" w:fill="F4F7F5"/>
           </w:tcPr>
           <w:p>
             <w:r>
-              <w:t>8B</w:t>
+              <w:t>reasoner_model</w:t>
             </w:r>
           </w:p>
         </w:tc>
         <w:tc>
           <w:tcPr>
-            <w:tcW w:type="dxa" w:w="1080"/>
+            <w:tcW w:type="dxa" w:w="2016"/>
             <w:shd w:val="clear" w:color="auto" w:fill="F4F7F5"/>
           </w:tcPr>
           <w:p>
             <w:r>
-              <w:t>Q4_K_M</w:t>
+              <w:t>Complex multi-step reasoning,</w:t>
+              <w:br/>
+              <w:t>verification, deep analysis</w:t>
             </w:r>
           </w:p>
         </w:tc>
@@ -1643,18 +1665,22 @@
           </w:tcPr>
           <w:p>
             <w:r>
-              <w:t>General purpose, documents</w:t>
+              <w:t>gpt-oss-120b</w:t>
+              <w:br/>
+              <w:t>(alt: phi4 for NPU speed)</w:t>
             </w:r>
           </w:p>
         </w:tc>
         <w:tc>
           <w:tcPr>
-            <w:tcW w:type="dxa" w:w="1296"/>
+            <w:tcW w:type="dxa" w:w="1440"/>
             <w:shd w:val="clear" w:color="auto" w:fill="F4F7F5"/>
           </w:tcPr>
           <w:p>
             <w:r>
-              <w:t>5–6 GB</w:t>
+              <w:t>iGPU (RDNA 3.5)</w:t>
+              <w:br/>
+              <w:t>~65 GB of 112 GB</w:t>
             </w:r>
           </w:p>
         </w:tc>
@@ -1662,34 +1688,36 @@
       <w:tr>
         <w:tc>
           <w:tcPr>
-            <w:tcW w:type="dxa" w:w="2664"/>
+            <w:tcW w:type="dxa" w:w="1080"/>
             <w:shd w:val="clear" w:color="auto" w:fill="FFFFFF"/>
           </w:tcPr>
           <w:p>
             <w:r>
-              <w:t>Meta Llama 3.1 8B Instruct</w:t>
+              <w:t>Coder</w:t>
             </w:r>
           </w:p>
         </w:tc>
         <w:tc>
           <w:tcPr>
-            <w:tcW w:type="dxa" w:w="1008"/>
+            <w:tcW w:type="dxa" w:w="1512"/>
             <w:shd w:val="clear" w:color="auto" w:fill="FFFFFF"/>
           </w:tcPr>
           <w:p>
             <w:r>
-              <w:t>8B</w:t>
+              <w:t>coder_model</w:t>
             </w:r>
           </w:p>
         </w:tc>
         <w:tc>
           <w:tcPr>
-            <w:tcW w:type="dxa" w:w="1080"/>
+            <w:tcW w:type="dxa" w:w="2016"/>
             <w:shd w:val="clear" w:color="auto" w:fill="FFFFFF"/>
           </w:tcPr>
           <w:p>
             <w:r>
-              <w:t>Q8_0</w:t>
+              <w:t>Code generation, document</w:t>
+              <w:br/>
+              <w:t>workshop, structured output</w:t>
             </w:r>
           </w:p>
         </w:tc>
@@ -1700,18 +1728,22 @@
           </w:tcPr>
           <w:p>
             <w:r>
-              <w:t>General purpose — high quality</w:t>
+              <w:t>qwen2.5-coder-32b</w:t>
+              <w:br/>
+              <w:t>(alt: Qwen3-Coder-30B-A3B)</w:t>
             </w:r>
           </w:p>
         </w:tc>
         <w:tc>
           <w:tcPr>
-            <w:tcW w:type="dxa" w:w="1296"/>
+            <w:tcW w:type="dxa" w:w="1440"/>
             <w:shd w:val="clear" w:color="auto" w:fill="FFFFFF"/>
           </w:tcPr>
           <w:p>
             <w:r>
-              <w:t>9–10 GB</w:t>
+              <w:t>iGPU</w:t>
+              <w:br/>
+              <w:t>~18 GB</w:t>
             </w:r>
           </w:p>
         </w:tc>
@@ -1719,34 +1751,36 @@
       <w:tr>
         <w:tc>
           <w:tcPr>
-            <w:tcW w:type="dxa" w:w="2664"/>
+            <w:tcW w:type="dxa" w:w="1080"/>
             <w:shd w:val="clear" w:color="auto" w:fill="F4F7F5"/>
           </w:tcPr>
           <w:p>
             <w:r>
-              <w:t>Mistral 7B Instruct v0.3</w:t>
+              <w:t>Embedder</w:t>
             </w:r>
           </w:p>
         </w:tc>
         <w:tc>
           <w:tcPr>
-            <w:tcW w:type="dxa" w:w="1008"/>
+            <w:tcW w:type="dxa" w:w="1512"/>
             <w:shd w:val="clear" w:color="auto" w:fill="F4F7F5"/>
           </w:tcPr>
           <w:p>
             <w:r>
-              <w:t>7B</w:t>
+              <w:t>embedder_model</w:t>
             </w:r>
           </w:p>
         </w:tc>
         <w:tc>
           <w:tcPr>
-            <w:tcW w:type="dxa" w:w="1080"/>
+            <w:tcW w:type="dxa" w:w="2016"/>
             <w:shd w:val="clear" w:color="auto" w:fill="F4F7F5"/>
           </w:tcPr>
           <w:p>
             <w:r>
-              <w:t>Q4_K_M</w:t>
+              <w:t>Semantic search vectors for</w:t>
+              <w:br/>
+              <w:t>all documents and knowledge</w:t>
             </w:r>
           </w:p>
         </w:tc>
@@ -1757,18 +1791,22 @@
           </w:tcPr>
           <w:p>
             <w:r>
-              <w:t>General chat, good baseline</w:t>
+              <w:t>nomic-embed-text</w:t>
+              <w:br/>
+              <w:t>(alt: Qwen3-Embedding-8B)</w:t>
             </w:r>
           </w:p>
         </w:tc>
         <w:tc>
           <w:tcPr>
-            <w:tcW w:type="dxa" w:w="1296"/>
+            <w:tcW w:type="dxa" w:w="1440"/>
             <w:shd w:val="clear" w:color="auto" w:fill="F4F7F5"/>
           </w:tcPr>
           <w:p>
             <w:r>
-              <w:t>5–6 GB</w:t>
+              <w:t>NPU / CPU</w:t>
+              <w:br/>
+              <w:t>~274 MB</w:t>
             </w:r>
           </w:p>
         </w:tc>
@@ -1776,34 +1814,36 @@
       <w:tr>
         <w:tc>
           <w:tcPr>
-            <w:tcW w:type="dxa" w:w="2664"/>
+            <w:tcW w:type="dxa" w:w="1080"/>
             <w:shd w:val="clear" w:color="auto" w:fill="FFFFFF"/>
           </w:tcPr>
           <w:p>
             <w:r>
-              <w:t>Microsoft Phi-4 Mini Instruct</w:t>
+              <w:t>Vision</w:t>
             </w:r>
           </w:p>
         </w:tc>
         <w:tc>
           <w:tcPr>
-            <w:tcW w:type="dxa" w:w="1008"/>
+            <w:tcW w:type="dxa" w:w="1512"/>
             <w:shd w:val="clear" w:color="auto" w:fill="FFFFFF"/>
           </w:tcPr>
           <w:p>
             <w:r>
-              <w:t>3.8B</w:t>
+              <w:t>vision_model</w:t>
             </w:r>
           </w:p>
         </w:tc>
         <w:tc>
           <w:tcPr>
-            <w:tcW w:type="dxa" w:w="1080"/>
+            <w:tcW w:type="dxa" w:w="2016"/>
             <w:shd w:val="clear" w:color="auto" w:fill="FFFFFF"/>
           </w:tcPr>
           <w:p>
             <w:r>
-              <w:t>Q4_K_M</w:t>
+              <w:t>OCR of scanned PDFs and</w:t>
+              <w:br/>
+              <w:t>images (Tesseract fallback)</w:t>
             </w:r>
           </w:p>
         </w:tc>
@@ -1814,18 +1854,20 @@
           </w:tcPr>
           <w:p>
             <w:r>
-              <w:t>CPU-friendly, reasoning tasks</w:t>
+              <w:t>Qwen3-VL-8B</w:t>
+              <w:br/>
+              <w:t>(leave empty → use Tesseract)</w:t>
             </w:r>
           </w:p>
         </w:tc>
         <w:tc>
           <w:tcPr>
-            <w:tcW w:type="dxa" w:w="1296"/>
+            <w:tcW w:type="dxa" w:w="1440"/>
             <w:shd w:val="clear" w:color="auto" w:fill="FFFFFF"/>
           </w:tcPr>
           <w:p>
             <w:r>
-              <w:t>3–4 GB</w:t>
+              <w:t>iGPU</w:t>
             </w:r>
           </w:p>
         </w:tc>
@@ -1833,34 +1875,36 @@
       <w:tr>
         <w:tc>
           <w:tcPr>
-            <w:tcW w:type="dxa" w:w="2664"/>
+            <w:tcW w:type="dxa" w:w="1080"/>
             <w:shd w:val="clear" w:color="auto" w:fill="F4F7F5"/>
           </w:tcPr>
           <w:p>
             <w:r>
-              <w:t>Microsoft Phi-4 Mini Instruct</w:t>
+              <w:t>Reranker</w:t>
             </w:r>
           </w:p>
         </w:tc>
         <w:tc>
           <w:tcPr>
-            <w:tcW w:type="dxa" w:w="1008"/>
+            <w:tcW w:type="dxa" w:w="1512"/>
             <w:shd w:val="clear" w:color="auto" w:fill="F4F7F5"/>
           </w:tcPr>
           <w:p>
             <w:r>
-              <w:t>3.8B</w:t>
+              <w:t>reranker_model</w:t>
             </w:r>
           </w:p>
         </w:tc>
         <w:tc>
           <w:tcPr>
-            <w:tcW w:type="dxa" w:w="1080"/>
+            <w:tcW w:type="dxa" w:w="2016"/>
             <w:shd w:val="clear" w:color="auto" w:fill="F4F7F5"/>
           </w:tcPr>
           <w:p>
             <w:r>
-              <w:t>Q8_0</w:t>
+              <w:t>Re-ranks search results for</w:t>
+              <w:br/>
+              <w:t>better retrieval quality</w:t>
             </w:r>
           </w:p>
         </w:tc>
@@ -1871,360 +1915,20 @@
           </w:tcPr>
           <w:p>
             <w:r>
-              <w:t>CPU-friendly — high quality</w:t>
+              <w:t>BAAI/bge-reranker-v2-m3</w:t>
+              <w:br/>
+              <w:t>(optional — leave empty)</w:t>
             </w:r>
           </w:p>
         </w:tc>
         <w:tc>
           <w:tcPr>
-            <w:tcW w:type="dxa" w:w="1296"/>
+            <w:tcW w:type="dxa" w:w="1440"/>
             <w:shd w:val="clear" w:color="auto" w:fill="F4F7F5"/>
           </w:tcPr>
           <w:p>
             <w:r>
-              <w:t>5–6 GB</w:t>
-            </w:r>
-          </w:p>
-        </w:tc>
-      </w:tr>
-      <w:tr>
-        <w:tc>
-          <w:tcPr>
-            <w:tcW w:type="dxa" w:w="2664"/>
-            <w:shd w:val="clear" w:color="auto" w:fill="FFFFFF"/>
-          </w:tcPr>
-          <w:p>
-            <w:r>
-              <w:t>Qwen 2.5 7B Instruct</w:t>
-            </w:r>
-          </w:p>
-        </w:tc>
-        <w:tc>
-          <w:tcPr>
-            <w:tcW w:type="dxa" w:w="1008"/>
-            <w:shd w:val="clear" w:color="auto" w:fill="FFFFFF"/>
-          </w:tcPr>
-          <w:p>
-            <w:r>
-              <w:t>7B</w:t>
-            </w:r>
-          </w:p>
-        </w:tc>
-        <w:tc>
-          <w:tcPr>
-            <w:tcW w:type="dxa" w:w="1080"/>
-            <w:shd w:val="clear" w:color="auto" w:fill="FFFFFF"/>
-          </w:tcPr>
-          <w:p>
-            <w:r>
-              <w:t>Q4_K_M</w:t>
-            </w:r>
-          </w:p>
-        </w:tc>
-        <w:tc>
-          <w:tcPr>
-            <w:tcW w:type="dxa" w:w="2376"/>
-            <w:shd w:val="clear" w:color="auto" w:fill="FFFFFF"/>
-          </w:tcPr>
-          <w:p>
-            <w:r>
-              <w:t>Multilingual, code, analysis</w:t>
-            </w:r>
-          </w:p>
-        </w:tc>
-        <w:tc>
-          <w:tcPr>
-            <w:tcW w:type="dxa" w:w="1296"/>
-            <w:shd w:val="clear" w:color="auto" w:fill="FFFFFF"/>
-          </w:tcPr>
-          <w:p>
-            <w:r>
-              <w:t>5–6 GB</w:t>
-            </w:r>
-          </w:p>
-        </w:tc>
-      </w:tr>
-      <w:tr>
-        <w:tc>
-          <w:tcPr>
-            <w:tcW w:type="dxa" w:w="2664"/>
-            <w:shd w:val="clear" w:color="auto" w:fill="F4F7F5"/>
-          </w:tcPr>
-          <w:p>
-            <w:r>
-              <w:t>Qwen 2.5 7B Instruct</w:t>
-            </w:r>
-          </w:p>
-        </w:tc>
-        <w:tc>
-          <w:tcPr>
-            <w:tcW w:type="dxa" w:w="1008"/>
-            <w:shd w:val="clear" w:color="auto" w:fill="F4F7F5"/>
-          </w:tcPr>
-          <w:p>
-            <w:r>
-              <w:t>7B</w:t>
-            </w:r>
-          </w:p>
-        </w:tc>
-        <w:tc>
-          <w:tcPr>
-            <w:tcW w:type="dxa" w:w="1080"/>
-            <w:shd w:val="clear" w:color="auto" w:fill="F4F7F5"/>
-          </w:tcPr>
-          <w:p>
-            <w:r>
-              <w:t>Q8_0</w:t>
-            </w:r>
-          </w:p>
-        </w:tc>
-        <w:tc>
-          <w:tcPr>
-            <w:tcW w:type="dxa" w:w="2376"/>
-            <w:shd w:val="clear" w:color="auto" w:fill="F4F7F5"/>
-          </w:tcPr>
-          <w:p>
-            <w:r>
-              <w:t>Multilingual — high quality</w:t>
-            </w:r>
-          </w:p>
-        </w:tc>
-        <w:tc>
-          <w:tcPr>
-            <w:tcW w:type="dxa" w:w="1296"/>
-            <w:shd w:val="clear" w:color="auto" w:fill="F4F7F5"/>
-          </w:tcPr>
-          <w:p>
-            <w:r>
-              <w:t>8–9 GB</w:t>
-            </w:r>
-          </w:p>
-        </w:tc>
-      </w:tr>
-      <w:tr>
-        <w:tc>
-          <w:tcPr>
-            <w:tcW w:type="dxa" w:w="2664"/>
-            <w:shd w:val="clear" w:color="auto" w:fill="FFFFFF"/>
-          </w:tcPr>
-          <w:p>
-            <w:r>
-              <w:t>Google Gemma 2 9B IT</w:t>
-            </w:r>
-          </w:p>
-        </w:tc>
-        <w:tc>
-          <w:tcPr>
-            <w:tcW w:type="dxa" w:w="1008"/>
-            <w:shd w:val="clear" w:color="auto" w:fill="FFFFFF"/>
-          </w:tcPr>
-          <w:p>
-            <w:r>
-              <w:t>9B</w:t>
-            </w:r>
-          </w:p>
-        </w:tc>
-        <w:tc>
-          <w:tcPr>
-            <w:tcW w:type="dxa" w:w="1080"/>
-            <w:shd w:val="clear" w:color="auto" w:fill="FFFFFF"/>
-          </w:tcPr>
-          <w:p>
-            <w:r>
-              <w:t>Q4_K_M</w:t>
-            </w:r>
-          </w:p>
-        </w:tc>
-        <w:tc>
-          <w:tcPr>
-            <w:tcW w:type="dxa" w:w="2376"/>
-            <w:shd w:val="clear" w:color="auto" w:fill="FFFFFF"/>
-          </w:tcPr>
-          <w:p>
-            <w:r>
-              <w:t>Long context, deep analysis</w:t>
-            </w:r>
-          </w:p>
-        </w:tc>
-        <w:tc>
-          <w:tcPr>
-            <w:tcW w:type="dxa" w:w="1296"/>
-            <w:shd w:val="clear" w:color="auto" w:fill="FFFFFF"/>
-          </w:tcPr>
-          <w:p>
-            <w:r>
-              <w:t>6–7 GB</w:t>
-            </w:r>
-          </w:p>
-        </w:tc>
-      </w:tr>
-      <w:tr>
-        <w:tc>
-          <w:tcPr>
-            <w:tcW w:type="dxa" w:w="2664"/>
-            <w:shd w:val="clear" w:color="auto" w:fill="F4F7F5"/>
-          </w:tcPr>
-          <w:p>
-            <w:r>
-              <w:t>Google Gemma 2 2B IT</w:t>
-            </w:r>
-          </w:p>
-        </w:tc>
-        <w:tc>
-          <w:tcPr>
-            <w:tcW w:type="dxa" w:w="1008"/>
-            <w:shd w:val="clear" w:color="auto" w:fill="F4F7F5"/>
-          </w:tcPr>
-          <w:p>
-            <w:r>
-              <w:t>2B</w:t>
-            </w:r>
-          </w:p>
-        </w:tc>
-        <w:tc>
-          <w:tcPr>
-            <w:tcW w:type="dxa" w:w="1080"/>
-            <w:shd w:val="clear" w:color="auto" w:fill="F4F7F5"/>
-          </w:tcPr>
-          <w:p>
-            <w:r>
-              <w:t>Q8_0</w:t>
-            </w:r>
-          </w:p>
-        </w:tc>
-        <w:tc>
-          <w:tcPr>
-            <w:tcW w:type="dxa" w:w="2376"/>
-            <w:shd w:val="clear" w:color="auto" w:fill="F4F7F5"/>
-          </w:tcPr>
-          <w:p>
-            <w:r>
-              <w:t>Ultra-fast, any hardware</w:t>
-            </w:r>
-          </w:p>
-        </w:tc>
-        <w:tc>
-          <w:tcPr>
-            <w:tcW w:type="dxa" w:w="1296"/>
-            <w:shd w:val="clear" w:color="auto" w:fill="F4F7F5"/>
-          </w:tcPr>
-          <w:p>
-            <w:r>
-              <w:t>2–3 GB</w:t>
-            </w:r>
-          </w:p>
-        </w:tc>
-      </w:tr>
-      <w:tr>
-        <w:tc>
-          <w:tcPr>
-            <w:tcW w:type="dxa" w:w="2664"/>
-            <w:shd w:val="clear" w:color="auto" w:fill="FFFFFF"/>
-          </w:tcPr>
-          <w:p>
-            <w:r>
-              <w:t>Mistral NeMo 12B Instruct</w:t>
-            </w:r>
-          </w:p>
-        </w:tc>
-        <w:tc>
-          <w:tcPr>
-            <w:tcW w:type="dxa" w:w="1008"/>
-            <w:shd w:val="clear" w:color="auto" w:fill="FFFFFF"/>
-          </w:tcPr>
-          <w:p>
-            <w:r>
-              <w:t>12B</w:t>
-            </w:r>
-          </w:p>
-        </w:tc>
-        <w:tc>
-          <w:tcPr>
-            <w:tcW w:type="dxa" w:w="1080"/>
-            <w:shd w:val="clear" w:color="auto" w:fill="FFFFFF"/>
-          </w:tcPr>
-          <w:p>
-            <w:r>
-              <w:t>Q4_K_M</w:t>
-            </w:r>
-          </w:p>
-        </w:tc>
-        <w:tc>
-          <w:tcPr>
-            <w:tcW w:type="dxa" w:w="2376"/>
-            <w:shd w:val="clear" w:color="auto" w:fill="FFFFFF"/>
-          </w:tcPr>
-          <w:p>
-            <w:r>
-              <w:t>Extended context (128k)</w:t>
-            </w:r>
-          </w:p>
-        </w:tc>
-        <w:tc>
-          <w:tcPr>
-            <w:tcW w:type="dxa" w:w="1296"/>
-            <w:shd w:val="clear" w:color="auto" w:fill="FFFFFF"/>
-          </w:tcPr>
-          <w:p>
-            <w:r>
-              <w:t>8–9 GB</w:t>
-            </w:r>
-          </w:p>
-        </w:tc>
-      </w:tr>
-      <w:tr>
-        <w:tc>
-          <w:tcPr>
-            <w:tcW w:type="dxa" w:w="2664"/>
-            <w:shd w:val="clear" w:color="auto" w:fill="F4F7F5"/>
-          </w:tcPr>
-          <w:p>
-            <w:r>
-              <w:t>Phi-3.5 Mini Instruct</w:t>
-            </w:r>
-          </w:p>
-        </w:tc>
-        <w:tc>
-          <w:tcPr>
-            <w:tcW w:type="dxa" w:w="1008"/>
-            <w:shd w:val="clear" w:color="auto" w:fill="F4F7F5"/>
-          </w:tcPr>
-          <w:p>
-            <w:r>
-              <w:t>3.8B</w:t>
-            </w:r>
-          </w:p>
-        </w:tc>
-        <w:tc>
-          <w:tcPr>
-            <w:tcW w:type="dxa" w:w="1080"/>
-            <w:shd w:val="clear" w:color="auto" w:fill="F4F7F5"/>
-          </w:tcPr>
-          <w:p>
-            <w:r>
-              <w:t>Q4_K_M</w:t>
-            </w:r>
-          </w:p>
-        </w:tc>
-        <w:tc>
-          <w:tcPr>
-            <w:tcW w:type="dxa" w:w="2376"/>
-            <w:shd w:val="clear" w:color="auto" w:fill="F4F7F5"/>
-          </w:tcPr>
-          <w:p>
-            <w:r>
-              <w:t>Lightweight, low latency</w:t>
-            </w:r>
-          </w:p>
-        </w:tc>
-        <w:tc>
-          <w:tcPr>
-            <w:tcW w:type="dxa" w:w="1296"/>
-            <w:shd w:val="clear" w:color="auto" w:fill="F4F7F5"/>
-          </w:tcPr>
-          <w:p>
-            <w:r>
-              <w:t>3–4 GB</w:t>
+              <w:t>CPU / NPU</w:t>
             </w:r>
           </w:p>
         </w:tc>
@@ -2242,7 +1946,7 @@
           <w:color w:val="1A5C2E"/>
           <w:sz w:val="20"/>
         </w:rPr>
-        <w:t>✅  Start with Phi-4 Mini Q4_K_M if you are on CPU. For 8 GB VRAM, Llama 3.1 8B Q4_K_M offers the best quality-to-speed ratio. For 16 GB+ VRAM, Mistral NeMo 12B gives excellent context handling.</w:t>
+        <w:t>✅  The Ryzen AI Max+ 395 has 128 GB unified memory with ~112 GB allocatable. llama3.3-70b (~40 GB) and gpt-oss-120b (~65 GB) both fit entirely on the iGPU — no CPU offload, no paging, full GPU speed.</w:t>
       </w:r>
     </w:p>
     <w:p>
@@ -2256,7 +1960,7 @@
           <w:color w:val="5A4200"/>
           <w:sz w:val="20"/>
         </w:rPr>
-        <w:t>💡  Download GGUF models from: https://huggingface.co/models?sort=downloads&amp;search=GGUF  Search the model name above and look for files ending in -Q4_K_M.gguf or -Q8_0.gguf.</w:t>
+        <w:t>💡  gpt-oss-120b is Microsoft's open-source 120B model, optimised for instruction following and long-context reasoning. It is the best local reasoner available and fits comfortably in the 112 GB GPU pool of this machine.</w:t>
       </w:r>
     </w:p>
     <w:p>
@@ -2264,7 +1968,15 @@
         <w:pStyle w:val="Heading2"/>
       </w:pPr>
       <w:r>
-        <w:t>Loading a model in Lemonade</w:t>
+        <w:t>Pulling all models at once</w:t>
+      </w:r>
+    </w:p>
+    <w:p>
+      <w:pPr>
+        <w:spacing w:after="120"/>
+      </w:pPr>
+      <w:r>
+        <w:t>Run these commands once after Lemonade is installed — they download everything Orivellum needs:</w:t>
       </w:r>
     </w:p>
     <w:p>
@@ -2279,19 +1991,20 @@
           <w:color w:val="1A1A2E"/>
           <w:sz w:val="18"/>
         </w:rPr>
-        <w:t># Load a GGUF model file</w:t>
+        <w:t>lemonade pull llama3.3-70b          # Workhorse — 70 B, 128 K context</w:t>
         <w:br/>
-        <w:t>lemonade load /path/to/Llama-3.1-8B-Instruct-Q4_K_M.gguf</w:t>
+        <w:t>lemonade pull gpt-oss-120b          # Reasoner  — 120 B, best local reasoning</w:t>
+        <w:br/>
+        <w:t>lemonade pull phi4                  # Fast NPU model, good reasoning fallback</w:t>
+        <w:br/>
+        <w:t>lemonade pull qwen2.5-coder-32b    # Coder     — 32 B, 256 K context</w:t>
+        <w:br/>
+        <w:t>lemonade pull nomic-embed-text     # Embedder  — 274 MB, always resident</w:t>
         <w:br/>
         <w:br/>
-        <w:t># List all loaded models</w:t>
+        <w:t># Verify everything downloaded:</w:t>
         <w:br/>
         <w:t>lemonade list</w:t>
-        <w:br/>
-        <w:br/>
-        <w:t># Example output:</w:t>
-        <w:br/>
-        <w:t># Llama-3.1-8B-Instruct-Q4_K_M   (loaded)  &lt;-- use this name in Orivellum Settings</w:t>
       </w:r>
     </w:p>
     <w:p>
@@ -2299,7 +2012,7 @@
         <w:pStyle w:val="Heading2"/>
       </w:pPr>
       <w:r>
-        <w:t>Setting the model in Orivellum</w:t>
+        <w:t>config.yaml — default model configuration</w:t>
       </w:r>
     </w:p>
     <w:p>
@@ -2307,7 +2020,48 @@
         <w:spacing w:after="120"/>
       </w:pPr>
       <w:r>
-        <w:t>Copy the model name shown by "lemonade list" and paste it into the Model ID field in Orivellum Settings. Leave the field blank to let Lemonade use whichever model is currently loaded.</w:t>
+        <w:t>The project ships with these defaults already set in config.yaml. Edit the file to swap models at any time — no restart required for most settings:</w:t>
+      </w:r>
+    </w:p>
+    <w:p>
+      <w:pPr>
+        <w:spacing w:before="80" w:after="120"/>
+        <w:ind w:left="432"/>
+        <w:shd w:val="clear" w:color="auto" w:fill="F0F4F8"/>
+      </w:pPr>
+      <w:r>
+        <w:rPr>
+          <w:rFonts w:ascii="Courier New" w:hAnsi="Courier New"/>
+          <w:color w:val="1A1A2E"/>
+          <w:sz w:val="18"/>
+        </w:rPr>
+        <w:t>models:</w:t>
+        <w:br/>
+        <w:t xml:space="preserve">  workhorse_model: "llama3.3-70b"          # General chat &amp; reasoning</w:t>
+        <w:br/>
+        <w:t xml:space="preserve">  reasoner_model:  "gpt-oss-120b"           # Deep analysis (toggle brain icon in chat)</w:t>
+        <w:br/>
+        <w:t xml:space="preserve">  coder_model:     "qwen2.5-coder-32b"      # Code &amp; structured output</w:t>
+        <w:br/>
+        <w:t xml:space="preserve">  embedder_model:  "nomic-embed-text"        # Semantic search</w:t>
+        <w:br/>
+        <w:t xml:space="preserve">  vision_model:    ""                        # Leave empty → Tesseract OCR</w:t>
+        <w:br/>
+        <w:t xml:space="preserve">  reranker_model:  ""                        # Leave empty → no reranking</w:t>
+      </w:r>
+    </w:p>
+    <w:p>
+      <w:pPr>
+        <w:spacing w:before="80" w:after="160"/>
+        <w:ind w:left="288" w:right="288"/>
+        <w:shd w:val="clear" w:color="auto" w:fill="E8F5E9"/>
+      </w:pPr>
+      <w:r>
+        <w:rPr>
+          <w:color w:val="1A5C2E"/>
+          <w:sz w:val="20"/>
+        </w:rPr>
+        <w:t>✅  In the chat interface, tap the brain icon (🧠) to switch from the Workhorse model to the Reasoner (gpt-oss-120b) for questions that need deeper analysis.</w:t>
       </w:r>
     </w:p>
     <w:p>

</xml_diff>

<commit_message>
Update Lemonade model lineup for Ryzen AI Max+ 395: MoE models replace dense 70B (catalog-exact names)
</commit_message>
<xml_diff>
--- a/docs/manual/Orivellum_Installation_Guide.docx
+++ b/docs/manual/Orivellum_Installation_Guide.docx
@@ -1277,7 +1277,7 @@
         <w:spacing w:after="120"/>
       </w:pPr>
       <w:r>
-        <w:t>Use lemonade pull to download models. These are the models Orivellum is configured to use:</w:t>
+        <w:t>Use lemonade pull to download models. Model names must match the Lemonade catalog EXACTLY — they double as the API model IDs. These are the models Orivellum is configured to use:</w:t>
       </w:r>
     </w:p>
     <w:p>
@@ -1292,34 +1292,48 @@
           <w:color w:val="1A1A2E"/>
           <w:sz w:val="18"/>
         </w:rPr>
-        <w:t># Primary chat model — 70 B on iGPU, 128 K context (~40 GB)</w:t>
+        <w:t># Workhorse — daily driver, MoE (~3 B active), vision built in (~23 GB)</w:t>
         <w:br/>
-        <w:t>lemonade pull llama3.3-70b</w:t>
+        <w:t>lemonade pull Qwen3.6-35B-A3B-GGUF</w:t>
         <w:br/>
         <w:br/>
-        <w:t># Reasoner — 120 B (fits entirely in 128 GB unified RAM)</w:t>
+        <w:t># Reasoner — 120 B MoE in native MXFP4 (~63 GB), best local reasoning</w:t>
         <w:br/>
-        <w:t>lemonade pull gpt-oss-120b</w:t>
+        <w:t>lemonade pull gpt-oss-120b-mxfp-GGUF</w:t>
         <w:br/>
         <w:br/>
-        <w:t># Fast model — runs on the NPU for sub-second first token</w:t>
+        <w:t># Coder — agentic coding, 256 K context (~19 GB)</w:t>
         <w:br/>
-        <w:t>lemonade pull phi4</w:t>
+        <w:t>lemonade pull Qwen3-Coder-30B-A3B-Instruct-GGUF</w:t>
         <w:br/>
         <w:br/>
-        <w:t># Coder — 32 B on iGPU, 256 K context</w:t>
+        <w:t># Embeddings for semantic search (~8 GB)</w:t>
         <w:br/>
-        <w:t>lemonade pull qwen2.5-coder-32b</w:t>
+        <w:t>lemonade pull Qwen3-Embedding-8B-GGUF</w:t>
         <w:br/>
         <w:br/>
-        <w:t># Embeddings for semantic search</w:t>
+        <w:t># OPTIONAL: fast low-power NPU model for quick Q&amp;A</w:t>
         <w:br/>
-        <w:t>lemonade pull nomic-embed-text</w:t>
+        <w:t>lemonade pull gpt-oss-20b-NPU</w:t>
         <w:br/>
         <w:br/>
         <w:t># Check what you have:</w:t>
         <w:br/>
         <w:t>lemonade list</w:t>
+      </w:r>
+    </w:p>
+    <w:p>
+      <w:pPr>
+        <w:spacing w:before="80" w:after="160"/>
+        <w:ind w:left="288" w:right="288"/>
+        <w:shd w:val="clear" w:color="auto" w:fill="E8F5E9"/>
+      </w:pPr>
+      <w:r>
+        <w:rPr>
+          <w:color w:val="1A5C2E"/>
+          <w:sz w:val="20"/>
+        </w:rPr>
+        <w:t>✅  Why no dense 70B? This machine's unified memory moves ~256 GB/s. A dense 70 B model reads all ~40 GB of weights for EVERY token (~4-5 tokens/sec). MoE models like gpt-oss-120b activate only ~5 B parameters per token — 30-40 tokens/sec at higher quality. On this hardware, MoE wins every time.</w:t>
       </w:r>
     </w:p>
     <w:p>
@@ -1412,7 +1426,7 @@
         <w:spacing w:after="60"/>
       </w:pPr>
       <w:r>
-        <w:t>NPU (XDNA2, 50 TOPS): 7–14 B models — low power, sub-second first token (phi4)</w:t>
+        <w:t>NPU (XDNA2, 50 TOPS): 7–20 B models — low power, sub-second first token (gpt-oss-20b-NPU)</w:t>
       </w:r>
     </w:p>
     <w:p>
@@ -1421,7 +1435,7 @@
         <w:spacing w:after="60"/>
       </w:pPr>
       <w:r>
-        <w:t>iGPU (40 RDNA 3.5 CUs, ≈ RTX 4070): 32–120 B models — full GPU offload (llama3.3-70b, gpt-oss-120b)</w:t>
+        <w:t>iGPU (40 RDNA 3.5 CUs, ≈ RTX 4070): the big models — Qwen3.6-35B-A3B, gpt-oss-120b</w:t>
       </w:r>
     </w:p>
     <w:p>
@@ -1430,7 +1444,7 @@
         <w:spacing w:after="60"/>
       </w:pPr>
       <w:r>
-        <w:t>Unified 128 GB LPDDR5X: no separate VRAM — all models fit entirely on-chip</w:t>
+        <w:t>Unified 128 GB LPDDR5X: no separate VRAM — even the 120 B reasoner fits entirely on-chip</w:t>
       </w:r>
     </w:p>
     <w:p>
@@ -1444,7 +1458,7 @@
           <w:color w:val="1A5C2E"/>
           <w:sz w:val="20"/>
         </w:rPr>
-        <w:t>✅  The Ryzen AI Max+ 395 has ~112 GB allocatable to models. llama3.3-70b uses ~40 GB, gpt-oss-120b uses ~65 GB — both fit comfortably.</w:t>
+        <w:t>✅  The Ryzen AI Max+ 395 has ~112 GB allocatable to models. The workhorse (~23 GB) and embedder (~8 GB) stay resident; the reasoner (~63 GB) and coder (~19 GB) load on demand — everything fits.</w:t>
       </w:r>
     </w:p>
     <w:p>
@@ -1602,9 +1616,9 @@
           </w:tcPr>
           <w:p>
             <w:r>
-              <w:t>llama3.3-70b</w:t>
+              <w:t>Qwen3.6-35B-A3B-GGUF</w:t>
               <w:br/>
-              <w:t>(alt: Qwen3-30B-A3B, Qwen3-32B)</w:t>
+              <w:t>(MoE, 3 B active — 50-70 tok/s)</w:t>
             </w:r>
           </w:p>
         </w:tc>
@@ -1617,7 +1631,7 @@
             <w:r>
               <w:t>iGPU (RDNA 3.5)</w:t>
               <w:br/>
-              <w:t>~40 GB of 112 GB</w:t>
+              <w:t>~23 GB of 112 GB</w:t>
             </w:r>
           </w:p>
         </w:tc>
@@ -1665,9 +1679,9 @@
           </w:tcPr>
           <w:p>
             <w:r>
-              <w:t>gpt-oss-120b</w:t>
+              <w:t>gpt-oss-120b-mxfp-GGUF</w:t>
               <w:br/>
-              <w:t>(alt: phi4 for NPU speed)</w:t>
+              <w:t>(MoE, 5.1 B active — 30-40 tok/s)</w:t>
             </w:r>
           </w:p>
         </w:tc>
@@ -1680,7 +1694,7 @@
             <w:r>
               <w:t>iGPU (RDNA 3.5)</w:t>
               <w:br/>
-              <w:t>~65 GB of 112 GB</w:t>
+              <w:t>~63 GB of 112 GB</w:t>
             </w:r>
           </w:p>
         </w:tc>
@@ -1728,9 +1742,9 @@
           </w:tcPr>
           <w:p>
             <w:r>
-              <w:t>qwen2.5-coder-32b</w:t>
+              <w:t>Qwen3-Coder-30B-A3B-Instruct-GGUF</w:t>
               <w:br/>
-              <w:t>(alt: Qwen3-Coder-30B-A3B)</w:t>
+              <w:t>(alt: Qwen3-Coder-Next-GGUF ~48 GB)</w:t>
             </w:r>
           </w:p>
         </w:tc>
@@ -1743,7 +1757,7 @@
             <w:r>
               <w:t>iGPU</w:t>
               <w:br/>
-              <w:t>~18 GB</w:t>
+              <w:t>~19 GB</w:t>
             </w:r>
           </w:p>
         </w:tc>
@@ -1791,9 +1805,9 @@
           </w:tcPr>
           <w:p>
             <w:r>
-              <w:t>nomic-embed-text</w:t>
+              <w:t>Qwen3-Embedding-8B-GGUF</w:t>
               <w:br/>
-              <w:t>(alt: Qwen3-Embedding-8B)</w:t>
+              <w:t>(alt: nomic-embed-text-v2-moe-GGUF)</w:t>
             </w:r>
           </w:p>
         </w:tc>
@@ -1804,9 +1818,9 @@
           </w:tcPr>
           <w:p>
             <w:r>
-              <w:t>NPU / CPU</w:t>
+              <w:t>iGPU / CPU</w:t>
               <w:br/>
-              <w:t>~274 MB</w:t>
+              <w:t>~8 GB</w:t>
             </w:r>
           </w:p>
         </w:tc>
@@ -1854,9 +1868,9 @@
           </w:tcPr>
           <w:p>
             <w:r>
-              <w:t>Qwen3-VL-8B</w:t>
+              <w:t>Qwen3.6-35B-A3B-GGUF</w:t>
               <w:br/>
-              <w:t>(leave empty → use Tesseract)</w:t>
+              <w:t>(same as Workhorse — no extra download)</w:t>
             </w:r>
           </w:p>
         </w:tc>
@@ -1915,7 +1929,7 @@
           </w:tcPr>
           <w:p>
             <w:r>
-              <w:t>BAAI/bge-reranker-v2-m3</w:t>
+              <w:t>bge-reranker-v2-m3-GGUF</w:t>
               <w:br/>
               <w:t>(optional — leave empty)</w:t>
             </w:r>
@@ -1946,7 +1960,7 @@
           <w:color w:val="1A5C2E"/>
           <w:sz w:val="20"/>
         </w:rPr>
-        <w:t>✅  The Ryzen AI Max+ 395 has 128 GB unified memory with ~112 GB allocatable. llama3.3-70b (~40 GB) and gpt-oss-120b (~65 GB) both fit entirely on the iGPU — no CPU offload, no paging, full GPU speed.</w:t>
+        <w:t>✅  The Ryzen AI Max+ 395 has 128 GB unified memory with ~112 GB allocatable. The workhorse (~23 GB) and embedder (~8 GB) stay resident; the reasoner (~63 GB) and coder (~19 GB) load on demand — no CPU offload, no paging, full GPU speed.</w:t>
       </w:r>
     </w:p>
     <w:p>
@@ -1960,7 +1974,7 @@
           <w:color w:val="5A4200"/>
           <w:sz w:val="20"/>
         </w:rPr>
-        <w:t>💡  gpt-oss-120b is Microsoft's open-source 120B model, optimised for instruction following and long-context reasoning. It is the best local reasoner available and fits comfortably in the 112 GB GPU pool of this machine.</w:t>
+        <w:t>💡  gpt-oss-120b is OpenAI's open-weight 120 B Mixture-of-Experts model, shipped in native MXFP4. Only ~5.1 B parameters are active per token, so it is BOTH the best local reasoner available AND fast on this machine (~30-40 tokens/sec).</w:t>
       </w:r>
     </w:p>
     <w:p>
@@ -1976,7 +1990,7 @@
         <w:spacing w:after="120"/>
       </w:pPr>
       <w:r>
-        <w:t>Run these commands once after Lemonade is installed — they download everything Orivellum needs:</w:t>
+        <w:t>Run these commands once after Lemonade is installed — they download everything Orivellum needs. Names must match the Lemonade catalog exactly (they double as API model IDs):</w:t>
       </w:r>
     </w:p>
     <w:p>
@@ -1991,15 +2005,17 @@
           <w:color w:val="1A1A2E"/>
           <w:sz w:val="18"/>
         </w:rPr>
-        <w:t>lemonade pull llama3.3-70b          # Workhorse — 70 B, 128 K context</w:t>
+        <w:t>lemonade pull Qwen3.6-35B-A3B-GGUF                # Workhorse — MoE, vision built in</w:t>
         <w:br/>
-        <w:t>lemonade pull gpt-oss-120b          # Reasoner  — 120 B, best local reasoning</w:t>
+        <w:t>lemonade pull gpt-oss-120b-mxfp-GGUF              # Reasoner  — best local reasoning</w:t>
         <w:br/>
-        <w:t>lemonade pull phi4                  # Fast NPU model, good reasoning fallback</w:t>
+        <w:t>lemonade pull Qwen3-Coder-30B-A3B-Instruct-GGUF   # Coder     — 256 K context</w:t>
         <w:br/>
-        <w:t>lemonade pull qwen2.5-coder-32b    # Coder     — 32 B, 256 K context</w:t>
+        <w:t>lemonade pull Qwen3-Embedding-8B-GGUF             # Embedder  — semantic search</w:t>
         <w:br/>
-        <w:t>lemonade pull nomic-embed-text     # Embedder  — 274 MB, always resident</w:t>
+        <w:t>lemonade pull gpt-oss-20b-NPU                     # Optional  — fast NPU model</w:t>
+        <w:br/>
+        <w:t>lemonade pull bge-reranker-v2-m3-GGUF             # Optional  — search reranker</w:t>
         <w:br/>
         <w:br/>
         <w:t># Verify everything downloaded:</w:t>
@@ -2037,17 +2053,17 @@
         </w:rPr>
         <w:t>models:</w:t>
         <w:br/>
-        <w:t xml:space="preserve">  workhorse_model: "llama3.3-70b"          # General chat &amp; reasoning</w:t>
+        <w:t xml:space="preserve">  workhorse_model: "Qwen3.6-35B-A3B-GGUF"              # General chat &amp; reasoning</w:t>
         <w:br/>
-        <w:t xml:space="preserve">  reasoner_model:  "gpt-oss-120b"           # Deep analysis (toggle brain icon in chat)</w:t>
+        <w:t xml:space="preserve">  reasoner_model:  "gpt-oss-120b-mxfp-GGUF"            # Deep analysis (brain icon in chat)</w:t>
         <w:br/>
-        <w:t xml:space="preserve">  coder_model:     "qwen2.5-coder-32b"      # Code &amp; structured output</w:t>
+        <w:t xml:space="preserve">  coder_model:     "Qwen3-Coder-30B-A3B-Instruct-GGUF" # Code &amp; structured output</w:t>
         <w:br/>
-        <w:t xml:space="preserve">  embedder_model:  "nomic-embed-text"        # Semantic search</w:t>
+        <w:t xml:space="preserve">  embedder_model:  "Qwen3-Embedding-8B-GGUF"           # Semantic search</w:t>
         <w:br/>
-        <w:t xml:space="preserve">  vision_model:    ""                        # Leave empty → Tesseract OCR</w:t>
+        <w:t xml:space="preserve">  vision_model:    "Qwen3.6-35B-A3B-GGUF"              # OCR (same model as workhorse)</w:t>
         <w:br/>
-        <w:t xml:space="preserve">  reranker_model:  ""                        # Leave empty → no reranking</w:t>
+        <w:t xml:space="preserve">  reranker_model:  ""                                   # Leave empty → no reranking</w:t>
       </w:r>
     </w:p>
     <w:p>

</xml_diff>

<commit_message>
Unify Lemonade port to 13305/api/v1 across config.yaml, scripts, and manuals (manual 4.2 A1)
</commit_message>
<xml_diff>
--- a/docs/manual/Orivellum_Installation_Guide.docx
+++ b/docs/manual/Orivellum_Installation_Guide.docx
@@ -1245,7 +1245,7 @@
         <w:br/>
         <w:t># Verify it is running:</w:t>
         <w:br/>
-        <w:t>Invoke-WebRequest http://127.0.0.1:8000/api/v0/health -UseBasicParsing</w:t>
+        <w:t>Invoke-WebRequest http://127.0.0.1:13305/api/v1/models -UseBasicParsing</w:t>
         <w:br/>
         <w:t># Expected: {"status":"ok"}</w:t>
       </w:r>
@@ -1383,7 +1383,7 @@
           <w:color w:val="1A1A2E"/>
           <w:sz w:val="18"/>
         </w:rPr>
-        <w:t>http://127.0.0.1:8000/v1</w:t>
+        <w:t>http://127.0.0.1:13305/api/v1</w:t>
       </w:r>
     </w:p>
     <w:p>

</xml_diff>